<commit_message>
Update Coordinate Reference Systems (CRS).docx
</commit_message>
<xml_diff>
--- a/Cartographic Foundation/Coordinate Reference Systems (CRS).docx
+++ b/Cartographic Foundation/Coordinate Reference Systems (CRS).docx
@@ -4,29 +4,50 @@
   <w:body>
     <w:p>
       <w:pPr>
+        <w:pStyle w:val="Heading1"/>
+        <w:pageBreakBefore/>
+        <w:bidi w:val="0"/>
+        <w:jc w:val="center"/>
+        <w:rPr>
+          <w:rFonts w:eastAsia="Times New Roman"/>
+          <w:b/>
+          <w:bCs/>
+          <w:lang w:eastAsia="en-GB"/>
+        </w:rPr>
+      </w:pPr>
+      <w:r>
+        <w:rPr>
+          <w:rFonts w:eastAsia="Times New Roman"/>
+          <w:b/>
+          <w:bCs/>
+          <w:lang w:eastAsia="en-GB"/>
+        </w:rPr>
+        <w:t>coordinate reference systems (CRS)</w:t>
+      </w:r>
+    </w:p>
+    <w:p>
+      <w:pPr>
         <w:pStyle w:val="ListParagraph"/>
         <w:numPr>
           <w:ilvl w:val="0"/>
-          <w:numId w:val="2"/>
+          <w:numId w:val="4"/>
         </w:numPr>
         <w:bidi w:val="0"/>
-      </w:pPr>
-      <w:proofErr w:type="spellStart"/>
+        <w:rPr>
+          <w:lang w:eastAsia="en-GB"/>
+        </w:rPr>
+      </w:pPr>
       <w:r>
-        <w:t>Swisstopo</w:t>
-      </w:r>
-      <w:proofErr w:type="spellEnd"/>
-      <w:r>
-        <w:t xml:space="preserve"> </w:t>
+        <w:rPr>
+          <w:lang w:eastAsia="en-GB"/>
+        </w:rPr>
+        <w:t>The three families of map projections</w:t>
       </w:r>
       <w:r>
-        <w:sym w:font="Wingdings" w:char="F0E8"/>
-      </w:r>
-      <w:r>
-        <w:t xml:space="preserve"> </w:t>
-      </w:r>
-      <w:r>
-        <w:t>Data scientist/analyst II (OSINT)</w:t>
+        <w:rPr>
+          <w:lang w:eastAsia="en-GB"/>
+        </w:rPr>
+        <w:t>:</w:t>
       </w:r>
     </w:p>
     <w:p>
@@ -34,17 +55,120 @@
         <w:pStyle w:val="ListParagraph"/>
         <w:numPr>
           <w:ilvl w:val="0"/>
-          <w:numId w:val="3"/>
+          <w:numId w:val="5"/>
         </w:numPr>
         <w:bidi w:val="0"/>
+        <w:rPr>
+          <w:lang w:eastAsia="en-GB"/>
+        </w:rPr>
       </w:pPr>
       <w:r>
-        <w:t xml:space="preserve">I must know </w:t>
+        <w:rPr>
+          <w:b/>
+          <w:bCs/>
+          <w:lang w:eastAsia="en-GB"/>
+        </w:rPr>
+        <w:t>planar projections</w:t>
       </w:r>
       <w:r>
-        <w:t>OSINT knowledge</w:t>
+        <w:rPr>
+          <w:b/>
+          <w:bCs/>
+          <w:lang w:eastAsia="en-GB"/>
+        </w:rPr>
+        <w:t>:</w:t>
+      </w:r>
+    </w:p>
+    <w:p>
+      <w:pPr>
+        <w:pStyle w:val="ListParagraph"/>
+        <w:numPr>
+          <w:ilvl w:val="0"/>
+          <w:numId w:val="5"/>
+        </w:numPr>
+        <w:bidi w:val="0"/>
+        <w:rPr>
+          <w:lang w:eastAsia="en-GB"/>
+        </w:rPr>
+      </w:pPr>
+      <w:r>
+        <w:rPr>
+          <w:b/>
+          <w:bCs/>
+          <w:lang w:eastAsia="en-GB"/>
+        </w:rPr>
+        <w:t>cylindrical projections</w:t>
       </w:r>
       <w:r>
+        <w:rPr>
+          <w:b/>
+          <w:bCs/>
+          <w:lang w:eastAsia="en-GB"/>
+        </w:rPr>
+        <w:t>:</w:t>
+      </w:r>
+    </w:p>
+    <w:p>
+      <w:pPr>
+        <w:pStyle w:val="ListParagraph"/>
+        <w:numPr>
+          <w:ilvl w:val="0"/>
+          <w:numId w:val="5"/>
+        </w:numPr>
+        <w:bidi w:val="0"/>
+        <w:rPr>
+          <w:lang w:eastAsia="en-GB"/>
+        </w:rPr>
+      </w:pPr>
+      <w:r>
+        <w:rPr>
+          <w:b/>
+          <w:bCs/>
+          <w:lang w:eastAsia="en-GB"/>
+        </w:rPr>
+        <w:t>conical projections</w:t>
+      </w:r>
+      <w:r>
+        <w:rPr>
+          <w:b/>
+          <w:bCs/>
+          <w:lang w:eastAsia="en-GB"/>
+        </w:rPr>
+        <w:t>:</w:t>
+      </w:r>
+    </w:p>
+    <w:p>
+      <w:pPr>
+        <w:pStyle w:val="ListParagraph"/>
+        <w:numPr>
+          <w:ilvl w:val="0"/>
+          <w:numId w:val="4"/>
+        </w:numPr>
+        <w:bidi w:val="0"/>
+        <w:rPr>
+          <w:lang w:eastAsia="en-GB"/>
+        </w:rPr>
+      </w:pPr>
+      <w:r>
+        <w:rPr>
+          <w:lang w:eastAsia="en-GB"/>
+        </w:rPr>
+        <w:t>Map projections are never absolutely accurate representations of the spherical earth. As a result of the map projection process, every map shows </w:t>
+      </w:r>
+      <w:r>
+        <w:rPr>
+          <w:b/>
+          <w:bCs/>
+          <w:lang w:eastAsia="en-GB"/>
+        </w:rPr>
+        <w:t>distortions of angular conformity, distance and area</w:t>
+      </w:r>
+      <w:r>
+        <w:rPr>
+          <w:b/>
+          <w:bCs/>
+          <w:lang w:eastAsia="en-GB"/>
+        </w:rPr>
         <w:t>.</w:t>
       </w:r>
     </w:p>
@@ -53,12 +177,36 @@
         <w:pStyle w:val="ListParagraph"/>
         <w:numPr>
           <w:ilvl w:val="0"/>
-          <w:numId w:val="3"/>
+          <w:numId w:val="4"/>
         </w:numPr>
         <w:bidi w:val="0"/>
+        <w:rPr>
+          <w:lang w:eastAsia="en-GB"/>
+        </w:rPr>
       </w:pPr>
       <w:r>
-        <w:t>Must have English, Italian, and French. Germany elementary level is good.</w:t>
+        <w:rPr>
+          <w:b/>
+          <w:bCs/>
+          <w:lang w:eastAsia="en-GB"/>
+        </w:rPr>
+        <w:t xml:space="preserve"> </w:t>
+      </w:r>
+      <w:r>
+        <w:rPr>
+          <w:b/>
+          <w:bCs/>
+          <w:lang w:eastAsia="en-GB"/>
+        </w:rPr>
+        <w:t>Examples of compromise projections</w:t>
+      </w:r>
+      <w:r>
+        <w:rPr>
+          <w:b/>
+          <w:bCs/>
+          <w:lang w:eastAsia="en-GB"/>
+        </w:rPr>
+        <w:t>:</w:t>
       </w:r>
     </w:p>
     <w:p>
@@ -66,15 +214,20 @@
         <w:pStyle w:val="ListParagraph"/>
         <w:numPr>
           <w:ilvl w:val="0"/>
-          <w:numId w:val="3"/>
+          <w:numId w:val="5"/>
         </w:numPr>
         <w:bidi w:val="0"/>
+        <w:rPr>
+          <w:lang w:eastAsia="en-GB"/>
+        </w:rPr>
       </w:pPr>
       <w:r>
-        <w:t>Collect, merge and analyze structured and unstructured data from open sources to develop information products</w:t>
-      </w:r>
-      <w:r>
-        <w:t>.</w:t>
+        <w:rPr>
+          <w:b/>
+          <w:bCs/>
+          <w:lang w:eastAsia="en-GB"/>
+        </w:rPr>
+        <w:t>Winkel Tripel projection</w:t>
       </w:r>
     </w:p>
     <w:p>
@@ -82,31 +235,79 @@
         <w:pStyle w:val="ListParagraph"/>
         <w:numPr>
           <w:ilvl w:val="0"/>
-          <w:numId w:val="3"/>
+          <w:numId w:val="5"/>
         </w:numPr>
         <w:bidi w:val="0"/>
+        <w:rPr>
+          <w:lang w:eastAsia="en-GB"/>
+        </w:rPr>
       </w:pPr>
       <w:r>
-        <w:t>Prepare geodata for information products, perform data analysis and modeling (using analysis tools and data mining methods), create visualizations and other cartography</w:t>
-      </w:r>
-      <w:r>
-        <w:t>.</w:t>
+        <w:rPr>
+          <w:b/>
+          <w:bCs/>
+          <w:lang w:eastAsia="en-GB"/>
+        </w:rPr>
+        <w:t>Robinson projection</w:t>
       </w:r>
     </w:p>
     <w:p>
       <w:pPr>
+        <w:bidi w:val="0"/>
+        <w:rPr>
+          <w:lang w:eastAsia="en-GB"/>
+        </w:rPr>
+      </w:pPr>
+    </w:p>
+    <w:p>
+      <w:pPr>
+        <w:bidi w:val="0"/>
+        <w:rPr>
+          <w:lang w:eastAsia="en-GB"/>
+        </w:rPr>
+      </w:pPr>
+    </w:p>
+    <w:p>
+      <w:pPr>
+        <w:bidi w:val="0"/>
+        <w:rPr>
+          <w:lang w:eastAsia="en-GB"/>
+        </w:rPr>
+      </w:pPr>
+    </w:p>
+    <w:p>
+      <w:pPr>
+        <w:bidi w:val="0"/>
+        <w:rPr>
+          <w:lang w:eastAsia="en-GB"/>
+        </w:rPr>
+      </w:pPr>
+    </w:p>
+    <w:p>
+      <w:pPr>
+        <w:bidi w:val="0"/>
+        <w:rPr>
+          <w:lang w:eastAsia="en-GB"/>
+        </w:rPr>
+      </w:pPr>
+    </w:p>
+    <w:p>
+      <w:pPr>
         <w:pStyle w:val="ListParagraph"/>
         <w:numPr>
           <w:ilvl w:val="0"/>
-          <w:numId w:val="3"/>
+          <w:numId w:val="4"/>
         </w:numPr>
         <w:bidi w:val="0"/>
+        <w:rPr>
+          <w:lang w:eastAsia="en-GB"/>
+        </w:rPr>
       </w:pPr>
       <w:r>
-        <w:t>Process and cross-reference information to confirm/disprove the hypotheses formulated</w:t>
-      </w:r>
-      <w:r>
-        <w:t>.</w:t>
+        <w:rPr>
+          <w:lang w:eastAsia="en-GB"/>
+        </w:rPr>
+        <w:t>Resources:</w:t>
       </w:r>
     </w:p>
     <w:p>
@@ -114,1143 +315,27 @@
         <w:pStyle w:val="ListParagraph"/>
         <w:numPr>
           <w:ilvl w:val="0"/>
-          <w:numId w:val="3"/>
+          <w:numId w:val="5"/>
         </w:numPr>
         <w:bidi w:val="0"/>
-      </w:pPr>
+        <w:rPr>
+          <w:lang w:eastAsia="en-GB"/>
+        </w:rPr>
+      </w:pPr>
+      <w:hyperlink r:id="rId5" w:history="1">
+        <w:r>
+          <w:rPr>
+            <w:rStyle w:val="Hyperlink"/>
+            <w:lang w:eastAsia="en-GB"/>
+          </w:rPr>
+          <w:t>https://docs.qgis.org/3.44/en/docs/gentle_gis_introduction/coordinate_reference_systems.html</w:t>
+        </w:r>
+      </w:hyperlink>
       <w:r>
-        <w:t>Follow and evaluate technical and methodological developments in the field of web intelligence/social media intelligence as well as in the FIMI topic</w:t>
-      </w:r>
-      <w:r>
-        <w:t>.</w:t>
-      </w:r>
-    </w:p>
-    <w:p>
-      <w:pPr>
-        <w:pStyle w:val="ListParagraph"/>
-        <w:numPr>
-          <w:ilvl w:val="0"/>
-          <w:numId w:val="3"/>
-        </w:numPr>
-        <w:bidi w:val="0"/>
-      </w:pPr>
-      <w:r>
-        <w:t>Act as a point of contact for questions, reports and technical discussions in your area of ​​analysis</w:t>
-      </w:r>
-      <w:r>
-        <w:t>.</w:t>
-      </w:r>
-    </w:p>
-    <w:p>
-      <w:pPr>
-        <w:pStyle w:val="ListParagraph"/>
-        <w:numPr>
-          <w:ilvl w:val="0"/>
-          <w:numId w:val="3"/>
-        </w:numPr>
-        <w:bidi w:val="0"/>
-      </w:pPr>
-      <w:r>
-        <w:t>Follow relevant developments in security policy and expand your knowledge</w:t>
-      </w:r>
-      <w:r>
-        <w:t>.</w:t>
-      </w:r>
-    </w:p>
-    <w:p>
-      <w:pPr>
-        <w:pStyle w:val="ListParagraph"/>
-        <w:numPr>
-          <w:ilvl w:val="0"/>
-          <w:numId w:val="3"/>
-        </w:numPr>
-        <w:bidi w:val="0"/>
-      </w:pPr>
-      <w:r>
-        <w:t>Autonomy, liveliness of spirit, ability to reason analytically, high team spirit and ease of writing</w:t>
-      </w:r>
-      <w:r>
-        <w:t>.</w:t>
-      </w:r>
-    </w:p>
-    <w:p>
-      <w:pPr>
-        <w:pStyle w:val="ListParagraph"/>
-        <w:numPr>
-          <w:ilvl w:val="0"/>
-          <w:numId w:val="3"/>
-        </w:numPr>
-        <w:bidi w:val="0"/>
-      </w:pPr>
-      <w:r>
-        <w:t>OSINT knowledge, mastery of Internet and social network research techniques, ability to investigate digital infrastructures</w:t>
-      </w:r>
-      <w:r>
-        <w:t>.</w:t>
-      </w:r>
-    </w:p>
-    <w:p>
-      <w:pPr>
-        <w:pStyle w:val="ListParagraph"/>
-        <w:numPr>
-          <w:ilvl w:val="0"/>
-          <w:numId w:val="3"/>
-        </w:numPr>
-        <w:bidi w:val="0"/>
-      </w:pPr>
-      <w:r>
-        <w:t>Experience in the following areas: programming languages ​​(especially Python); tools used for collection, analysis, and visualization; knowledge of good development practices (git, CI/CD)</w:t>
-      </w:r>
-      <w:r>
-        <w:t>.</w:t>
-      </w:r>
-    </w:p>
-    <w:p>
-      <w:pPr>
-        <w:pStyle w:val="ListParagraph"/>
-        <w:numPr>
-          <w:ilvl w:val="0"/>
-          <w:numId w:val="3"/>
-        </w:numPr>
-        <w:bidi w:val="0"/>
-      </w:pPr>
-      <w:r>
-        <w:t>Ability to focus on objectives and results, interest in new technologies and subjects related to international security policy</w:t>
-      </w:r>
-      <w:r>
-        <w:t>.</w:t>
-      </w:r>
-    </w:p>
-    <w:p>
-      <w:pPr>
-        <w:pStyle w:val="ListParagraph"/>
-        <w:numPr>
-          <w:ilvl w:val="0"/>
-          <w:numId w:val="3"/>
-        </w:numPr>
-        <w:bidi w:val="0"/>
-      </w:pPr>
-      <w:r>
-        <w:t>Good working knowledge of a second official language and excellent English skills. Fluency in other foreign languages ​​is an advantage.</w:t>
-      </w:r>
-    </w:p>
-    <w:p>
-      <w:pPr>
-        <w:pStyle w:val="ListParagraph"/>
-        <w:numPr>
-          <w:ilvl w:val="0"/>
-          <w:numId w:val="2"/>
-        </w:numPr>
-        <w:bidi w:val="0"/>
-      </w:pPr>
-      <w:proofErr w:type="spellStart"/>
-      <w:r>
-        <w:t>Kadaster</w:t>
-      </w:r>
-      <w:proofErr w:type="spellEnd"/>
-      <w:r>
+        <w:rPr>
+          <w:lang w:eastAsia="en-GB"/>
+        </w:rPr>
         <w:t xml:space="preserve"> </w:t>
-      </w:r>
-      <w:r>
-        <w:sym w:font="Wingdings" w:char="F0E8"/>
-      </w:r>
-      <w:r>
-        <w:t xml:space="preserve"> </w:t>
-      </w:r>
-      <w:r>
-        <w:t>Data Asset Manager Geodesy</w:t>
-      </w:r>
-    </w:p>
-    <w:p>
-      <w:pPr>
-        <w:pStyle w:val="Heading1"/>
-        <w:pageBreakBefore/>
-        <w:bidi w:val="0"/>
-        <w:jc w:val="center"/>
-        <w:rPr>
-          <w:b/>
-          <w:bCs/>
-        </w:rPr>
-      </w:pPr>
-      <w:r>
-        <w:rPr>
-          <w:b/>
-          <w:bCs/>
-        </w:rPr>
-        <w:lastRenderedPageBreak/>
-        <w:t>OSINT knowledge</w:t>
-      </w:r>
-    </w:p>
-    <w:p>
-      <w:pPr>
-        <w:pStyle w:val="ListParagraph"/>
-        <w:numPr>
-          <w:ilvl w:val="0"/>
-          <w:numId w:val="2"/>
-        </w:numPr>
-        <w:bidi w:val="0"/>
-        <w:spacing w:after="0" w:line="240" w:lineRule="auto"/>
-        <w:rPr>
-          <w:rFonts w:ascii="Times New Roman" w:eastAsia="Times New Roman" w:hAnsi="Times New Roman" w:cs="Times New Roman"/>
-          <w:kern w:val="0"/>
-          <w:sz w:val="24"/>
-          <w:szCs w:val="24"/>
-          <w:lang w:val="en-GB" w:eastAsia="en-GB"/>
-          <w14:ligatures w14:val="none"/>
-        </w:rPr>
-      </w:pPr>
-      <w:r>
-        <w:rPr>
-          <w:rFonts w:ascii="Times New Roman" w:eastAsia="Times New Roman" w:hAnsi="Times New Roman" w:cs="Times New Roman"/>
-          <w:b/>
-          <w:bCs/>
-          <w:kern w:val="0"/>
-          <w:sz w:val="24"/>
-          <w:szCs w:val="24"/>
-          <w:lang w:val="en-GB" w:eastAsia="en-GB"/>
-          <w14:ligatures w14:val="none"/>
-        </w:rPr>
-        <w:t>Master the Cartographic Foundation</w:t>
-      </w:r>
-      <w:r>
-        <w:rPr>
-          <w:rFonts w:ascii="Times New Roman" w:eastAsia="Times New Roman" w:hAnsi="Times New Roman" w:cs="Times New Roman"/>
-          <w:kern w:val="0"/>
-          <w:sz w:val="24"/>
-          <w:szCs w:val="24"/>
-          <w:lang w:val="en-GB" w:eastAsia="en-GB"/>
-          <w14:ligatures w14:val="none"/>
-        </w:rPr>
-        <w:t xml:space="preserve"> </w:t>
-      </w:r>
-      <w:r>
-        <w:rPr>
-          <w:lang w:val="en-GB" w:eastAsia="en-GB"/>
-        </w:rPr>
-        <w:sym w:font="Wingdings" w:char="F0E8"/>
-      </w:r>
-      <w:r>
-        <w:rPr>
-          <w:rFonts w:ascii="Times New Roman" w:eastAsia="Times New Roman" w:hAnsi="Times New Roman" w:cs="Times New Roman"/>
-          <w:kern w:val="0"/>
-          <w:sz w:val="24"/>
-          <w:szCs w:val="24"/>
-          <w:lang w:val="en-GB" w:eastAsia="en-GB"/>
-          <w14:ligatures w14:val="none"/>
-        </w:rPr>
-        <w:t xml:space="preserve"> </w:t>
-      </w:r>
-      <w:r>
-        <w:rPr>
-          <w:rFonts w:ascii="Times New Roman" w:eastAsia="Times New Roman" w:hAnsi="Times New Roman" w:cs="Times New Roman"/>
-          <w:kern w:val="0"/>
-          <w:sz w:val="24"/>
-          <w:szCs w:val="24"/>
-          <w:lang w:val="en-GB" w:eastAsia="en-GB"/>
-          <w14:ligatures w14:val="none"/>
-        </w:rPr>
-        <w:t>Do not touch digital tools until you understand the physical earth.</w:t>
-      </w:r>
-    </w:p>
-    <w:p>
-      <w:pPr>
-        <w:pStyle w:val="ListParagraph"/>
-        <w:numPr>
-          <w:ilvl w:val="0"/>
-          <w:numId w:val="3"/>
-        </w:numPr>
-        <w:bidi w:val="0"/>
-        <w:spacing w:after="0" w:line="240" w:lineRule="auto"/>
-        <w:rPr>
-          <w:rFonts w:eastAsia="Times New Roman" w:cstheme="minorHAnsi"/>
-          <w:kern w:val="0"/>
-          <w:sz w:val="24"/>
-          <w:szCs w:val="24"/>
-          <w:lang w:val="en-GB" w:eastAsia="en-GB"/>
-          <w14:ligatures w14:val="none"/>
-        </w:rPr>
-      </w:pPr>
-      <w:r>
-        <w:rPr>
-          <w:rFonts w:eastAsia="Times New Roman" w:cstheme="minorHAnsi"/>
-          <w:kern w:val="0"/>
-          <w:sz w:val="24"/>
-          <w:szCs w:val="24"/>
-          <w:lang w:eastAsia="en-GB"/>
-          <w14:ligatures w14:val="none"/>
-        </w:rPr>
-        <w:t xml:space="preserve">Eminence requires understanding the mathematics of maps. A </w:t>
-      </w:r>
-      <w:proofErr w:type="spellStart"/>
-      <w:r>
-        <w:rPr>
-          <w:rFonts w:eastAsia="Times New Roman" w:cstheme="minorHAnsi"/>
-          <w:kern w:val="0"/>
-          <w:sz w:val="24"/>
-          <w:szCs w:val="24"/>
-          <w:lang w:eastAsia="en-GB"/>
-          <w14:ligatures w14:val="none"/>
-        </w:rPr>
-        <w:t>Swisstopo</w:t>
-      </w:r>
-      <w:proofErr w:type="spellEnd"/>
-      <w:r>
-        <w:rPr>
-          <w:rFonts w:eastAsia="Times New Roman" w:cstheme="minorHAnsi"/>
-          <w:kern w:val="0"/>
-          <w:sz w:val="24"/>
-          <w:szCs w:val="24"/>
-          <w:lang w:eastAsia="en-GB"/>
-          <w14:ligatures w14:val="none"/>
-        </w:rPr>
-        <w:t xml:space="preserve"> veteran knows that maps </w:t>
-      </w:r>
-      <w:proofErr w:type="gramStart"/>
-      <w:r>
-        <w:rPr>
-          <w:rFonts w:eastAsia="Times New Roman" w:cstheme="minorHAnsi"/>
-          <w:kern w:val="0"/>
-          <w:sz w:val="24"/>
-          <w:szCs w:val="24"/>
-          <w:lang w:eastAsia="en-GB"/>
-          <w14:ligatures w14:val="none"/>
-        </w:rPr>
-        <w:t>lie</w:t>
-      </w:r>
-      <w:proofErr w:type="gramEnd"/>
-      <w:r>
-        <w:rPr>
-          <w:rFonts w:eastAsia="Times New Roman" w:cstheme="minorHAnsi"/>
-          <w:kern w:val="0"/>
-          <w:sz w:val="24"/>
-          <w:szCs w:val="24"/>
-          <w:lang w:eastAsia="en-GB"/>
-          <w14:ligatures w14:val="none"/>
-        </w:rPr>
-        <w:t xml:space="preserve"> </w:t>
-      </w:r>
-      <w:r>
-        <w:rPr>
-          <w:rFonts w:eastAsia="Times New Roman" w:cstheme="minorHAnsi"/>
-          <w:kern w:val="0"/>
-          <w:sz w:val="24"/>
-          <w:szCs w:val="24"/>
-          <w:lang w:eastAsia="en-GB"/>
-          <w14:ligatures w14:val="none"/>
-        </w:rPr>
-        <w:t>they are flat representations of a 3D object, meaning they always distort distance, area, or direction</w:t>
-      </w:r>
-      <w:r>
-        <w:rPr>
-          <w:rFonts w:eastAsia="Times New Roman" w:cstheme="minorHAnsi"/>
-          <w:kern w:val="0"/>
-          <w:sz w:val="24"/>
-          <w:szCs w:val="24"/>
-          <w:lang w:eastAsia="en-GB"/>
-          <w14:ligatures w14:val="none"/>
-        </w:rPr>
-        <w:t>.</w:t>
-      </w:r>
-    </w:p>
-    <w:p>
-      <w:pPr>
-        <w:pStyle w:val="ListParagraph"/>
-        <w:numPr>
-          <w:ilvl w:val="0"/>
-          <w:numId w:val="3"/>
-        </w:numPr>
-        <w:bidi w:val="0"/>
-        <w:spacing w:after="0" w:line="240" w:lineRule="auto"/>
-        <w:rPr>
-          <w:rFonts w:eastAsia="Times New Roman" w:cstheme="minorHAnsi"/>
-          <w:kern w:val="0"/>
-          <w:sz w:val="24"/>
-          <w:szCs w:val="24"/>
-          <w:lang w:val="en-GB" w:eastAsia="en-GB"/>
-          <w14:ligatures w14:val="none"/>
-        </w:rPr>
-      </w:pPr>
-      <w:r>
-        <w:rPr>
-          <w:rFonts w:eastAsia="Times New Roman" w:cstheme="minorHAnsi"/>
-          <w:b/>
-          <w:bCs/>
-          <w:kern w:val="0"/>
-          <w:sz w:val="24"/>
-          <w:szCs w:val="24"/>
-          <w:lang w:eastAsia="en-GB"/>
-          <w14:ligatures w14:val="none"/>
-        </w:rPr>
-        <w:t>Study Geodesy and Projections:</w:t>
-      </w:r>
-      <w:r>
-        <w:rPr>
-          <w:rFonts w:eastAsia="Times New Roman" w:cstheme="minorHAnsi"/>
-          <w:kern w:val="0"/>
-          <w:sz w:val="24"/>
-          <w:szCs w:val="24"/>
-          <w:lang w:eastAsia="en-GB"/>
-          <w14:ligatures w14:val="none"/>
-        </w:rPr>
-        <w:t xml:space="preserve"> Learn the difference between Mercator (preserves angles, distorts size) and Robinson (compromises both for visual balance). Understand coordinate reference systems (CRS), particularly </w:t>
-      </w:r>
-      <w:r>
-        <w:rPr>
-          <w:rFonts w:eastAsia="Times New Roman" w:cstheme="minorHAnsi"/>
-          <w:b/>
-          <w:bCs/>
-          <w:kern w:val="0"/>
-          <w:sz w:val="24"/>
-          <w:szCs w:val="24"/>
-          <w:lang w:eastAsia="en-GB"/>
-          <w14:ligatures w14:val="none"/>
-        </w:rPr>
-        <w:t>WGS 84</w:t>
-      </w:r>
-      <w:r>
-        <w:rPr>
-          <w:rFonts w:eastAsia="Times New Roman" w:cstheme="minorHAnsi"/>
-          <w:kern w:val="0"/>
-          <w:sz w:val="24"/>
-          <w:szCs w:val="24"/>
-          <w:lang w:eastAsia="en-GB"/>
-          <w14:ligatures w14:val="none"/>
-        </w:rPr>
-        <w:t xml:space="preserve"> (global standard) and local grids like the </w:t>
-      </w:r>
-      <w:r>
-        <w:rPr>
-          <w:rFonts w:eastAsia="Times New Roman" w:cstheme="minorHAnsi"/>
-          <w:b/>
-          <w:bCs/>
-          <w:kern w:val="0"/>
-          <w:sz w:val="24"/>
-          <w:szCs w:val="24"/>
-          <w:lang w:eastAsia="en-GB"/>
-          <w14:ligatures w14:val="none"/>
-        </w:rPr>
-        <w:t>Swiss CH1903/LV03</w:t>
-      </w:r>
-      <w:r>
-        <w:rPr>
-          <w:rFonts w:eastAsia="Times New Roman" w:cstheme="minorHAnsi"/>
-          <w:b/>
-          <w:bCs/>
-          <w:kern w:val="0"/>
-          <w:sz w:val="24"/>
-          <w:szCs w:val="24"/>
-          <w:lang w:eastAsia="en-GB"/>
-          <w14:ligatures w14:val="none"/>
-        </w:rPr>
-        <w:t>.</w:t>
-      </w:r>
-    </w:p>
-    <w:p>
-      <w:pPr>
-        <w:pStyle w:val="ListParagraph"/>
-        <w:numPr>
-          <w:ilvl w:val="0"/>
-          <w:numId w:val="3"/>
-        </w:numPr>
-        <w:bidi w:val="0"/>
-        <w:spacing w:after="0" w:line="240" w:lineRule="auto"/>
-        <w:rPr>
-          <w:rFonts w:eastAsia="Times New Roman" w:cstheme="minorHAnsi"/>
-          <w:kern w:val="0"/>
-          <w:sz w:val="24"/>
-          <w:szCs w:val="24"/>
-          <w:lang w:val="en-GB" w:eastAsia="en-GB"/>
-          <w14:ligatures w14:val="none"/>
-        </w:rPr>
-      </w:pPr>
-      <w:r>
-        <w:rPr>
-          <w:rFonts w:eastAsia="Times New Roman" w:cstheme="minorHAnsi"/>
-          <w:b/>
-          <w:bCs/>
-          <w:kern w:val="0"/>
-          <w:sz w:val="24"/>
-          <w:szCs w:val="24"/>
-          <w:lang w:eastAsia="en-GB"/>
-          <w14:ligatures w14:val="none"/>
-        </w:rPr>
-        <w:t>Read Topography:</w:t>
-      </w:r>
-      <w:r>
-        <w:rPr>
-          <w:rFonts w:eastAsia="Times New Roman" w:cstheme="minorHAnsi"/>
-          <w:kern w:val="0"/>
-          <w:sz w:val="24"/>
-          <w:szCs w:val="24"/>
-          <w:lang w:eastAsia="en-GB"/>
-          <w14:ligatures w14:val="none"/>
-        </w:rPr>
-        <w:t xml:space="preserve"> You must be able to read contour lines fluidly. Look at a topographic map and instantly visualize the slope, peaks, saddles, and valleys</w:t>
-      </w:r>
-      <w:r>
-        <w:rPr>
-          <w:rFonts w:eastAsia="Times New Roman" w:cstheme="minorHAnsi"/>
-          <w:kern w:val="0"/>
-          <w:sz w:val="24"/>
-          <w:szCs w:val="24"/>
-          <w:lang w:eastAsia="en-GB"/>
-          <w14:ligatures w14:val="none"/>
-        </w:rPr>
-        <w:t>.</w:t>
-      </w:r>
-    </w:p>
-    <w:p>
-      <w:pPr>
-        <w:pStyle w:val="ListParagraph"/>
-        <w:numPr>
-          <w:ilvl w:val="0"/>
-          <w:numId w:val="3"/>
-        </w:numPr>
-        <w:bidi w:val="0"/>
-        <w:spacing w:after="0" w:line="240" w:lineRule="auto"/>
-        <w:rPr>
-          <w:rFonts w:eastAsia="Times New Roman" w:cstheme="minorHAnsi"/>
-          <w:kern w:val="0"/>
-          <w:sz w:val="24"/>
-          <w:szCs w:val="24"/>
-          <w:lang w:val="en-GB" w:eastAsia="en-GB"/>
-          <w14:ligatures w14:val="none"/>
-        </w:rPr>
-      </w:pPr>
-      <w:r>
-        <w:rPr>
-          <w:rFonts w:eastAsia="Times New Roman" w:cstheme="minorHAnsi"/>
-          <w:b/>
-          <w:bCs/>
-          <w:kern w:val="0"/>
-          <w:sz w:val="24"/>
-          <w:szCs w:val="24"/>
-          <w:lang w:eastAsia="en-GB"/>
-          <w14:ligatures w14:val="none"/>
-        </w:rPr>
-        <w:t>Understand Elevation Models:</w:t>
-      </w:r>
-      <w:r>
-        <w:rPr>
-          <w:rFonts w:eastAsia="Times New Roman" w:cstheme="minorHAnsi"/>
-          <w:kern w:val="0"/>
-          <w:sz w:val="24"/>
-          <w:szCs w:val="24"/>
-          <w:lang w:eastAsia="en-GB"/>
-          <w14:ligatures w14:val="none"/>
-        </w:rPr>
-        <w:t xml:space="preserve"> Learn the difference between a DEM (Digital Elevation Model), DTM (Digital Terrain Model), and DSM (Digital Surface Model). This is crucial for determining lines of sight and shadow casting</w:t>
-      </w:r>
-      <w:r>
-        <w:rPr>
-          <w:rFonts w:eastAsia="Times New Roman" w:cstheme="minorHAnsi"/>
-          <w:kern w:val="0"/>
-          <w:sz w:val="24"/>
-          <w:szCs w:val="24"/>
-          <w:lang w:eastAsia="en-GB"/>
-          <w14:ligatures w14:val="none"/>
-        </w:rPr>
-        <w:t>.</w:t>
-      </w:r>
-    </w:p>
-    <w:p>
-      <w:pPr>
-        <w:pStyle w:val="ListParagraph"/>
-        <w:bidi w:val="0"/>
-        <w:spacing w:after="0" w:line="240" w:lineRule="auto"/>
-        <w:ind w:left="786"/>
-        <w:rPr>
-          <w:rFonts w:eastAsia="Times New Roman" w:cstheme="minorHAnsi"/>
-          <w:kern w:val="0"/>
-          <w:sz w:val="24"/>
-          <w:szCs w:val="24"/>
-          <w:lang w:val="en-GB" w:eastAsia="en-GB"/>
-          <w14:ligatures w14:val="none"/>
-        </w:rPr>
-      </w:pPr>
-    </w:p>
-    <w:p>
-      <w:pPr>
-        <w:pStyle w:val="ListParagraph"/>
-        <w:numPr>
-          <w:ilvl w:val="0"/>
-          <w:numId w:val="2"/>
-        </w:numPr>
-        <w:bidi w:val="0"/>
-        <w:spacing w:after="0" w:line="240" w:lineRule="auto"/>
-        <w:rPr>
-          <w:rFonts w:ascii="Times New Roman" w:eastAsia="Times New Roman" w:hAnsi="Times New Roman" w:cs="Times New Roman"/>
-          <w:kern w:val="0"/>
-          <w:sz w:val="24"/>
-          <w:szCs w:val="24"/>
-          <w:lang w:val="en-GB" w:eastAsia="en-GB"/>
-          <w14:ligatures w14:val="none"/>
-        </w:rPr>
-      </w:pPr>
-      <w:r>
-        <w:rPr>
-          <w:rFonts w:ascii="Times New Roman" w:eastAsia="Times New Roman" w:hAnsi="Times New Roman" w:cs="Times New Roman"/>
-          <w:b/>
-          <w:bCs/>
-          <w:kern w:val="0"/>
-          <w:sz w:val="24"/>
-          <w:szCs w:val="24"/>
-          <w:lang w:val="en-GB" w:eastAsia="en-GB"/>
-          <w14:ligatures w14:val="none"/>
-        </w:rPr>
-        <w:t>Build Your GIS Arsenal</w:t>
-      </w:r>
-      <w:r>
-        <w:rPr>
-          <w:rFonts w:ascii="Times New Roman" w:eastAsia="Times New Roman" w:hAnsi="Times New Roman" w:cs="Times New Roman"/>
-          <w:kern w:val="0"/>
-          <w:sz w:val="24"/>
-          <w:szCs w:val="24"/>
-          <w:lang w:val="en-GB" w:eastAsia="en-GB"/>
-          <w14:ligatures w14:val="none"/>
-        </w:rPr>
-        <w:t xml:space="preserve"> </w:t>
-      </w:r>
-      <w:r>
-        <w:rPr>
-          <w:rFonts w:ascii="Times New Roman" w:eastAsia="Times New Roman" w:hAnsi="Times New Roman" w:cs="Times New Roman"/>
-          <w:kern w:val="0"/>
-          <w:sz w:val="24"/>
-          <w:szCs w:val="24"/>
-          <w:lang w:val="en-GB" w:eastAsia="en-GB"/>
-          <w14:ligatures w14:val="none"/>
-        </w:rPr>
-        <w:sym w:font="Wingdings" w:char="F0E8"/>
-      </w:r>
-      <w:r>
-        <w:rPr>
-          <w:rFonts w:ascii="Times New Roman" w:eastAsia="Times New Roman" w:hAnsi="Times New Roman" w:cs="Times New Roman"/>
-          <w:kern w:val="0"/>
-          <w:sz w:val="24"/>
-          <w:szCs w:val="24"/>
-          <w:lang w:val="en-GB" w:eastAsia="en-GB"/>
-          <w14:ligatures w14:val="none"/>
-        </w:rPr>
-        <w:t xml:space="preserve"> </w:t>
-      </w:r>
-      <w:r>
-        <w:rPr>
-          <w:rFonts w:ascii="Times New Roman" w:eastAsia="Times New Roman" w:hAnsi="Times New Roman" w:cs="Times New Roman"/>
-          <w:kern w:val="0"/>
-          <w:sz w:val="24"/>
-          <w:szCs w:val="24"/>
-          <w:lang w:val="en-GB" w:eastAsia="en-GB"/>
-          <w14:ligatures w14:val="none"/>
-        </w:rPr>
-        <w:t>Transition from consumer apps to professional analytical tools.</w:t>
-      </w:r>
-    </w:p>
-    <w:p>
-      <w:pPr>
-        <w:pStyle w:val="ListParagraph"/>
-        <w:numPr>
-          <w:ilvl w:val="0"/>
-          <w:numId w:val="3"/>
-        </w:numPr>
-        <w:bidi w:val="0"/>
-      </w:pPr>
-      <w:r>
-        <w:t>Google Maps is for tourists; QGIS is for analysts. You need to manipulate raw spatial data, layer it, and extract intelligence from it.</w:t>
-      </w:r>
-    </w:p>
-    <w:p>
-      <w:pPr>
-        <w:pStyle w:val="ListParagraph"/>
-        <w:numPr>
-          <w:ilvl w:val="0"/>
-          <w:numId w:val="3"/>
-        </w:numPr>
-        <w:bidi w:val="0"/>
-      </w:pPr>
-      <w:r>
-        <w:rPr>
-          <w:b/>
-          <w:bCs/>
-        </w:rPr>
-        <w:t>Master QGIS:</w:t>
-      </w:r>
-      <w:r>
-        <w:t xml:space="preserve"> This is the industry-standard open-source Geographic Information System. Learn how to import shapefiles, </w:t>
-      </w:r>
-      <w:proofErr w:type="spellStart"/>
-      <w:r>
-        <w:t>GeoTIFFs</w:t>
-      </w:r>
-      <w:proofErr w:type="spellEnd"/>
-      <w:r>
-        <w:t>, and plot coordinate data</w:t>
-      </w:r>
-      <w:r>
-        <w:t>.</w:t>
-      </w:r>
-    </w:p>
-    <w:p>
-      <w:pPr>
-        <w:pStyle w:val="ListParagraph"/>
-        <w:numPr>
-          <w:ilvl w:val="0"/>
-          <w:numId w:val="3"/>
-        </w:numPr>
-        <w:bidi w:val="0"/>
-      </w:pPr>
-      <w:r>
-        <w:rPr>
-          <w:b/>
-          <w:bCs/>
-        </w:rPr>
-        <w:t>Harness Overpass Turbo:</w:t>
-      </w:r>
-      <w:r>
-        <w:t xml:space="preserve"> Learn the </w:t>
-      </w:r>
-      <w:r>
-        <w:rPr>
-          <w:b/>
-          <w:bCs/>
-        </w:rPr>
-        <w:t>Overpass QL</w:t>
-      </w:r>
-      <w:r>
-        <w:t xml:space="preserve"> language to query OpenStreetMap (OSM) data. If you have an image of a blue water tower within 50 meters of a railway crossing, Overpass can find every location on Earth that matches those exact parameters in seconds</w:t>
-      </w:r>
-      <w:r>
-        <w:t>.</w:t>
-      </w:r>
-    </w:p>
-    <w:p>
-      <w:pPr>
-        <w:pStyle w:val="ListParagraph"/>
-        <w:numPr>
-          <w:ilvl w:val="0"/>
-          <w:numId w:val="3"/>
-        </w:numPr>
-        <w:bidi w:val="0"/>
-      </w:pPr>
-      <w:r>
-        <w:rPr>
-          <w:b/>
-          <w:bCs/>
-        </w:rPr>
-        <w:t>Exploit Historical Imagery:</w:t>
-      </w:r>
-      <w:r>
-        <w:t xml:space="preserve"> Google Earth Pro (desktop version) is mandatory for its historical imagery slider. Landscape changes—deforestation, construction, seasonal snow melt—are often the key to </w:t>
-      </w:r>
-      <w:proofErr w:type="spellStart"/>
-      <w:r>
-        <w:t>chronolocation</w:t>
-      </w:r>
-      <w:proofErr w:type="spellEnd"/>
-      <w:r>
-        <w:t xml:space="preserve"> (determining </w:t>
-      </w:r>
-      <w:r>
-        <w:rPr>
-          <w:i/>
-          <w:iCs/>
-        </w:rPr>
-        <w:t>when</w:t>
-      </w:r>
-      <w:r>
-        <w:t xml:space="preserve"> an image was taken)</w:t>
-      </w:r>
-      <w:r>
-        <w:t>.</w:t>
-      </w:r>
-    </w:p>
-    <w:p>
-      <w:pPr>
-        <w:pStyle w:val="ListParagraph"/>
-        <w:bidi w:val="0"/>
-        <w:ind w:left="786"/>
-      </w:pPr>
-    </w:p>
-    <w:p>
-      <w:pPr>
-        <w:pStyle w:val="ListParagraph"/>
-        <w:numPr>
-          <w:ilvl w:val="0"/>
-          <w:numId w:val="2"/>
-        </w:numPr>
-        <w:bidi w:val="0"/>
-      </w:pPr>
-      <w:r>
-        <w:rPr>
-          <w:b/>
-          <w:bCs/>
-        </w:rPr>
-        <w:t>Develop Advanced IMINT &amp; Geolocation Tactics</w:t>
-      </w:r>
-      <w:r>
-        <w:t xml:space="preserve"> </w:t>
-      </w:r>
-      <w:r>
-        <w:sym w:font="Wingdings" w:char="F0E8"/>
-      </w:r>
-      <w:r>
-        <w:t xml:space="preserve"> </w:t>
-      </w:r>
-      <w:r>
-        <w:t>Learn to extract clues from single pixels.</w:t>
-      </w:r>
-    </w:p>
-    <w:p>
-      <w:pPr>
-        <w:pStyle w:val="ListParagraph"/>
-        <w:numPr>
-          <w:ilvl w:val="0"/>
-          <w:numId w:val="3"/>
-        </w:numPr>
-        <w:bidi w:val="0"/>
-      </w:pPr>
-      <w:r>
-        <w:t>This is where the detective work happens. You must train your eyes to see what others ignore</w:t>
-      </w:r>
-      <w:r>
-        <w:t>.</w:t>
-      </w:r>
-    </w:p>
-    <w:p>
-      <w:pPr>
-        <w:pStyle w:val="ListParagraph"/>
-        <w:numPr>
-          <w:ilvl w:val="0"/>
-          <w:numId w:val="3"/>
-        </w:numPr>
-        <w:bidi w:val="0"/>
-      </w:pPr>
-      <w:r>
-        <w:rPr>
-          <w:b/>
-          <w:bCs/>
-        </w:rPr>
-        <w:t>Shadow Analysis</w:t>
-      </w:r>
-      <w:r>
-        <w:t xml:space="preserve">: Use tools like </w:t>
-      </w:r>
-      <w:proofErr w:type="spellStart"/>
-      <w:r>
-        <w:t>SunCalc</w:t>
-      </w:r>
-      <w:proofErr w:type="spellEnd"/>
-      <w:r>
-        <w:t xml:space="preserve"> to determine the exact time of day an image was taken based on the angle and length of shadows. You will need to understand solar azimuth and elevation.</w:t>
-      </w:r>
-    </w:p>
-    <w:p>
-      <w:pPr>
-        <w:pStyle w:val="ListParagraph"/>
-        <w:numPr>
-          <w:ilvl w:val="0"/>
-          <w:numId w:val="3"/>
-        </w:numPr>
-        <w:bidi w:val="0"/>
-      </w:pPr>
-      <w:r>
-        <w:rPr>
-          <w:b/>
-          <w:bCs/>
-        </w:rPr>
-        <w:t>Infrastructure Signatures</w:t>
-      </w:r>
-      <w:r>
-        <w:t>: Learn regional differences in road markings, utility poles, street signs, and roof tiling. A true expert knows that a specific type of concrete railway sleeper might only be used in Eastern Europe.</w:t>
-      </w:r>
-    </w:p>
-    <w:p>
-      <w:pPr>
-        <w:pStyle w:val="ListParagraph"/>
-        <w:numPr>
-          <w:ilvl w:val="0"/>
-          <w:numId w:val="3"/>
-        </w:numPr>
-        <w:bidi w:val="0"/>
-      </w:pPr>
-      <w:r>
-        <w:rPr>
-          <w:b/>
-          <w:bCs/>
-        </w:rPr>
-        <w:t>Vegetation and Geology</w:t>
-      </w:r>
-      <w:r>
-        <w:t xml:space="preserve">: Study the biosphere. Recognizing a specific type of pine </w:t>
-      </w:r>
-      <w:proofErr w:type="gramStart"/>
-      <w:r>
-        <w:t>tree, or</w:t>
-      </w:r>
-      <w:proofErr w:type="gramEnd"/>
-      <w:r>
-        <w:t xml:space="preserve"> knowing that a certain red soil indicates high iron oxide (common in specific global regions), narrows your search area by millions of square miles.</w:t>
-      </w:r>
-    </w:p>
-    <w:p>
-      <w:pPr>
-        <w:pStyle w:val="ListParagraph"/>
-        <w:bidi w:val="0"/>
-        <w:ind w:left="786"/>
-      </w:pPr>
-    </w:p>
-    <w:p>
-      <w:pPr>
-        <w:pStyle w:val="ListParagraph"/>
-        <w:numPr>
-          <w:ilvl w:val="0"/>
-          <w:numId w:val="2"/>
-        </w:numPr>
-        <w:bidi w:val="0"/>
-      </w:pPr>
-      <w:r>
-        <w:rPr>
-          <w:b/>
-          <w:bCs/>
-        </w:rPr>
-        <w:t>Learn Spatial Data Scraping and Automation</w:t>
-      </w:r>
-      <w:r>
-        <w:t xml:space="preserve"> </w:t>
-      </w:r>
-      <w:r>
-        <w:sym w:font="Wingdings" w:char="F0E8"/>
-      </w:r>
-      <w:r>
-        <w:t xml:space="preserve"> </w:t>
-      </w:r>
-      <w:r>
-        <w:t>Scale your analysis using code</w:t>
-      </w:r>
-      <w:r>
-        <w:t>.</w:t>
-      </w:r>
-    </w:p>
-    <w:p>
-      <w:pPr>
-        <w:pStyle w:val="ListParagraph"/>
-        <w:numPr>
-          <w:ilvl w:val="0"/>
-          <w:numId w:val="3"/>
-        </w:numPr>
-        <w:bidi w:val="0"/>
-      </w:pPr>
-      <w:r>
-        <w:t>An eminent analyst doesn't search manually if a script can do it for them.</w:t>
-      </w:r>
-    </w:p>
-    <w:p>
-      <w:pPr>
-        <w:pStyle w:val="ListParagraph"/>
-        <w:numPr>
-          <w:ilvl w:val="0"/>
-          <w:numId w:val="3"/>
-        </w:numPr>
-        <w:bidi w:val="0"/>
-      </w:pPr>
-      <w:r>
-        <w:rPr>
-          <w:b/>
-          <w:bCs/>
-        </w:rPr>
-        <w:t>Learn Python for Geo</w:t>
-      </w:r>
-      <w:r>
-        <w:t xml:space="preserve">: Focus on libraries like </w:t>
-      </w:r>
-      <w:proofErr w:type="spellStart"/>
-      <w:r>
-        <w:t>GeoPandas</w:t>
-      </w:r>
-      <w:proofErr w:type="spellEnd"/>
-      <w:r>
-        <w:t xml:space="preserve"> (for manipulating spatial data), GDAL (for reading raster/vector data), and Folium (for visualizing data on interactive maps).</w:t>
-      </w:r>
-    </w:p>
-    <w:p>
-      <w:pPr>
-        <w:pStyle w:val="ListParagraph"/>
-        <w:numPr>
-          <w:ilvl w:val="0"/>
-          <w:numId w:val="3"/>
-        </w:numPr>
-        <w:bidi w:val="0"/>
-      </w:pPr>
-      <w:r>
-        <w:rPr>
-          <w:b/>
-          <w:bCs/>
-        </w:rPr>
-        <w:t>API Exploitation</w:t>
-      </w:r>
-      <w:r>
-        <w:t xml:space="preserve">: Learn to pull raw satellite data directly from the Sentinel Hub API or NASA's </w:t>
-      </w:r>
-      <w:proofErr w:type="spellStart"/>
-      <w:r>
-        <w:t>Earthdata</w:t>
-      </w:r>
-      <w:proofErr w:type="spellEnd"/>
-      <w:r>
-        <w:t>.</w:t>
-      </w:r>
-    </w:p>
-    <w:p>
-      <w:pPr>
-        <w:pStyle w:val="ListParagraph"/>
-        <w:numPr>
-          <w:ilvl w:val="0"/>
-          <w:numId w:val="3"/>
-        </w:numPr>
-        <w:bidi w:val="0"/>
-      </w:pPr>
-      <w:r>
-        <w:rPr>
-          <w:b/>
-          <w:bCs/>
-        </w:rPr>
-        <w:t>Automated Change Detection</w:t>
-      </w:r>
-      <w:r>
-        <w:t>: Write scripts that compare two satellite images of the same location over time and highlight pixel changes (e.g., detecting new military encampments or deforestation).</w:t>
-      </w:r>
-    </w:p>
-    <w:p>
-      <w:pPr>
-        <w:bidi w:val="0"/>
-      </w:pPr>
-    </w:p>
-    <w:p>
-      <w:pPr>
-        <w:bidi w:val="0"/>
-      </w:pPr>
-    </w:p>
-    <w:p>
-      <w:pPr>
-        <w:pStyle w:val="ListParagraph"/>
-        <w:numPr>
-          <w:ilvl w:val="0"/>
-          <w:numId w:val="2"/>
-        </w:numPr>
-        <w:bidi w:val="0"/>
-      </w:pPr>
-      <w:r>
-        <w:rPr>
-          <w:b/>
-          <w:bCs/>
-        </w:rPr>
-        <w:lastRenderedPageBreak/>
-        <w:t>Publish and Establish Eminence</w:t>
-      </w:r>
-      <w:r>
-        <w:t xml:space="preserve"> </w:t>
-      </w:r>
-      <w:r>
-        <w:sym w:font="Wingdings" w:char="F0E8"/>
-      </w:r>
-      <w:r>
-        <w:t xml:space="preserve"> </w:t>
-      </w:r>
-      <w:proofErr w:type="spellStart"/>
-      <w:r>
-        <w:t>Eminence</w:t>
-      </w:r>
-      <w:proofErr w:type="spellEnd"/>
-      <w:r>
-        <w:t xml:space="preserve"> is granted by the community, not claimed</w:t>
-      </w:r>
-    </w:p>
-    <w:p>
-      <w:pPr>
-        <w:pStyle w:val="ListParagraph"/>
-        <w:numPr>
-          <w:ilvl w:val="0"/>
-          <w:numId w:val="3"/>
-        </w:numPr>
-        <w:bidi w:val="0"/>
-      </w:pPr>
-      <w:r>
-        <w:t xml:space="preserve">You become eminent by showing your work, educating others, and solving high-profile problems. </w:t>
-      </w:r>
-    </w:p>
-    <w:p>
-      <w:pPr>
-        <w:pStyle w:val="ListParagraph"/>
-        <w:numPr>
-          <w:ilvl w:val="0"/>
-          <w:numId w:val="3"/>
-        </w:numPr>
-        <w:bidi w:val="0"/>
-      </w:pPr>
-      <w:r>
-        <w:rPr>
-          <w:b/>
-          <w:bCs/>
-        </w:rPr>
-        <w:t>Focus on Methodology, Not Just Results</w:t>
-      </w:r>
-      <w:r>
-        <w:t xml:space="preserve">: When you geolocate a difficult image, don't just post the coordinates. Write a detailed breakdown of how you found it. Explain the dead ends, the logic you applied, and the tools you used. </w:t>
-      </w:r>
-    </w:p>
-    <w:p>
-      <w:pPr>
-        <w:pStyle w:val="ListParagraph"/>
-        <w:numPr>
-          <w:ilvl w:val="0"/>
-          <w:numId w:val="3"/>
-        </w:numPr>
-        <w:bidi w:val="0"/>
-      </w:pPr>
-      <w:r>
-        <w:rPr>
-          <w:b/>
-          <w:bCs/>
-        </w:rPr>
-        <w:t>Contribute to Open Source</w:t>
-      </w:r>
-      <w:r>
-        <w:t xml:space="preserve">: Edit and improve OpenStreetMap. Build custom QGIS plugins and share them on GitHub. </w:t>
-      </w:r>
-    </w:p>
-    <w:p>
-      <w:pPr>
-        <w:pStyle w:val="ListParagraph"/>
-        <w:numPr>
-          <w:ilvl w:val="0"/>
-          <w:numId w:val="3"/>
-        </w:numPr>
-        <w:bidi w:val="0"/>
-      </w:pPr>
-      <w:r>
-        <w:rPr>
-          <w:b/>
-          <w:bCs/>
-        </w:rPr>
-        <w:t>Engage with the Community</w:t>
-      </w:r>
-      <w:r>
-        <w:t xml:space="preserve">: Publish your case studies on platforms like Medium or your own blog. Participate in </w:t>
-      </w:r>
-      <w:proofErr w:type="spellStart"/>
-      <w:r>
-        <w:t>Geoguessr</w:t>
-      </w:r>
-      <w:proofErr w:type="spellEnd"/>
-      <w:r>
-        <w:t xml:space="preserve"> at a competitive level to keep your visual identification skills </w:t>
-      </w:r>
-      <w:proofErr w:type="gramStart"/>
-      <w:r>
-        <w:t>sharp, and</w:t>
-      </w:r>
-      <w:proofErr w:type="gramEnd"/>
-      <w:r>
-        <w:t xml:space="preserve"> engage with OSINT collectives like Bellingcat or Trace Labs.</w:t>
       </w:r>
     </w:p>
     <w:sectPr>
@@ -1498,6 +583,230 @@
     </w:lvl>
   </w:abstractNum>
   <w:abstractNum w:abstractNumId="2" w15:restartNumberingAfterBreak="0">
+    <w:nsid w:val="3CA00A15"/>
+    <w:multiLevelType w:val="hybridMultilevel"/>
+    <w:tmpl w:val="7B3062CE"/>
+    <w:lvl w:ilvl="0" w:tplc="26887824">
+      <w:numFmt w:val="bullet"/>
+      <w:lvlText w:val="-"/>
+      <w:lvlJc w:val="left"/>
+      <w:pPr>
+        <w:ind w:left="360" w:hanging="360"/>
+      </w:pPr>
+      <w:rPr>
+        <w:rFonts w:ascii="Calibri" w:eastAsiaTheme="minorHAnsi" w:hAnsi="Calibri" w:cs="Calibri" w:hint="default"/>
+      </w:rPr>
+    </w:lvl>
+    <w:lvl w:ilvl="1" w:tplc="08090003" w:tentative="1">
+      <w:start w:val="1"/>
+      <w:numFmt w:val="bullet"/>
+      <w:lvlText w:val="o"/>
+      <w:lvlJc w:val="left"/>
+      <w:pPr>
+        <w:ind w:left="1080" w:hanging="360"/>
+      </w:pPr>
+      <w:rPr>
+        <w:rFonts w:ascii="Courier New" w:hAnsi="Courier New" w:cs="Courier New" w:hint="default"/>
+      </w:rPr>
+    </w:lvl>
+    <w:lvl w:ilvl="2" w:tplc="08090005" w:tentative="1">
+      <w:start w:val="1"/>
+      <w:numFmt w:val="bullet"/>
+      <w:lvlText w:val=""/>
+      <w:lvlJc w:val="left"/>
+      <w:pPr>
+        <w:ind w:left="1800" w:hanging="360"/>
+      </w:pPr>
+      <w:rPr>
+        <w:rFonts w:ascii="Wingdings" w:hAnsi="Wingdings" w:hint="default"/>
+      </w:rPr>
+    </w:lvl>
+    <w:lvl w:ilvl="3" w:tplc="08090001" w:tentative="1">
+      <w:start w:val="1"/>
+      <w:numFmt w:val="bullet"/>
+      <w:lvlText w:val=""/>
+      <w:lvlJc w:val="left"/>
+      <w:pPr>
+        <w:ind w:left="2520" w:hanging="360"/>
+      </w:pPr>
+      <w:rPr>
+        <w:rFonts w:ascii="Symbol" w:hAnsi="Symbol" w:hint="default"/>
+      </w:rPr>
+    </w:lvl>
+    <w:lvl w:ilvl="4" w:tplc="08090003" w:tentative="1">
+      <w:start w:val="1"/>
+      <w:numFmt w:val="bullet"/>
+      <w:lvlText w:val="o"/>
+      <w:lvlJc w:val="left"/>
+      <w:pPr>
+        <w:ind w:left="3240" w:hanging="360"/>
+      </w:pPr>
+      <w:rPr>
+        <w:rFonts w:ascii="Courier New" w:hAnsi="Courier New" w:cs="Courier New" w:hint="default"/>
+      </w:rPr>
+    </w:lvl>
+    <w:lvl w:ilvl="5" w:tplc="08090005" w:tentative="1">
+      <w:start w:val="1"/>
+      <w:numFmt w:val="bullet"/>
+      <w:lvlText w:val=""/>
+      <w:lvlJc w:val="left"/>
+      <w:pPr>
+        <w:ind w:left="3960" w:hanging="360"/>
+      </w:pPr>
+      <w:rPr>
+        <w:rFonts w:ascii="Wingdings" w:hAnsi="Wingdings" w:hint="default"/>
+      </w:rPr>
+    </w:lvl>
+    <w:lvl w:ilvl="6" w:tplc="08090001" w:tentative="1">
+      <w:start w:val="1"/>
+      <w:numFmt w:val="bullet"/>
+      <w:lvlText w:val=""/>
+      <w:lvlJc w:val="left"/>
+      <w:pPr>
+        <w:ind w:left="4680" w:hanging="360"/>
+      </w:pPr>
+      <w:rPr>
+        <w:rFonts w:ascii="Symbol" w:hAnsi="Symbol" w:hint="default"/>
+      </w:rPr>
+    </w:lvl>
+    <w:lvl w:ilvl="7" w:tplc="08090003" w:tentative="1">
+      <w:start w:val="1"/>
+      <w:numFmt w:val="bullet"/>
+      <w:lvlText w:val="o"/>
+      <w:lvlJc w:val="left"/>
+      <w:pPr>
+        <w:ind w:left="5400" w:hanging="360"/>
+      </w:pPr>
+      <w:rPr>
+        <w:rFonts w:ascii="Courier New" w:hAnsi="Courier New" w:cs="Courier New" w:hint="default"/>
+      </w:rPr>
+    </w:lvl>
+    <w:lvl w:ilvl="8" w:tplc="08090005" w:tentative="1">
+      <w:start w:val="1"/>
+      <w:numFmt w:val="bullet"/>
+      <w:lvlText w:val=""/>
+      <w:lvlJc w:val="left"/>
+      <w:pPr>
+        <w:ind w:left="6120" w:hanging="360"/>
+      </w:pPr>
+      <w:rPr>
+        <w:rFonts w:ascii="Wingdings" w:hAnsi="Wingdings" w:hint="default"/>
+      </w:rPr>
+    </w:lvl>
+  </w:abstractNum>
+  <w:abstractNum w:abstractNumId="3" w15:restartNumberingAfterBreak="0">
+    <w:nsid w:val="3D5E0837"/>
+    <w:multiLevelType w:val="hybridMultilevel"/>
+    <w:tmpl w:val="A558A560"/>
+    <w:lvl w:ilvl="0" w:tplc="C5EEB38C">
+      <w:numFmt w:val="bullet"/>
+      <w:lvlText w:val=""/>
+      <w:lvlJc w:val="left"/>
+      <w:pPr>
+        <w:ind w:left="644" w:hanging="360"/>
+      </w:pPr>
+      <w:rPr>
+        <w:rFonts w:ascii="Symbol" w:eastAsiaTheme="minorHAnsi" w:hAnsi="Symbol" w:cstheme="minorBidi" w:hint="default"/>
+      </w:rPr>
+    </w:lvl>
+    <w:lvl w:ilvl="1" w:tplc="08090003" w:tentative="1">
+      <w:start w:val="1"/>
+      <w:numFmt w:val="bullet"/>
+      <w:lvlText w:val="o"/>
+      <w:lvlJc w:val="left"/>
+      <w:pPr>
+        <w:ind w:left="1364" w:hanging="360"/>
+      </w:pPr>
+      <w:rPr>
+        <w:rFonts w:ascii="Courier New" w:hAnsi="Courier New" w:cs="Courier New" w:hint="default"/>
+      </w:rPr>
+    </w:lvl>
+    <w:lvl w:ilvl="2" w:tplc="08090005" w:tentative="1">
+      <w:start w:val="1"/>
+      <w:numFmt w:val="bullet"/>
+      <w:lvlText w:val=""/>
+      <w:lvlJc w:val="left"/>
+      <w:pPr>
+        <w:ind w:left="2084" w:hanging="360"/>
+      </w:pPr>
+      <w:rPr>
+        <w:rFonts w:ascii="Wingdings" w:hAnsi="Wingdings" w:hint="default"/>
+      </w:rPr>
+    </w:lvl>
+    <w:lvl w:ilvl="3" w:tplc="08090001" w:tentative="1">
+      <w:start w:val="1"/>
+      <w:numFmt w:val="bullet"/>
+      <w:lvlText w:val=""/>
+      <w:lvlJc w:val="left"/>
+      <w:pPr>
+        <w:ind w:left="2804" w:hanging="360"/>
+      </w:pPr>
+      <w:rPr>
+        <w:rFonts w:ascii="Symbol" w:hAnsi="Symbol" w:hint="default"/>
+      </w:rPr>
+    </w:lvl>
+    <w:lvl w:ilvl="4" w:tplc="08090003" w:tentative="1">
+      <w:start w:val="1"/>
+      <w:numFmt w:val="bullet"/>
+      <w:lvlText w:val="o"/>
+      <w:lvlJc w:val="left"/>
+      <w:pPr>
+        <w:ind w:left="3524" w:hanging="360"/>
+      </w:pPr>
+      <w:rPr>
+        <w:rFonts w:ascii="Courier New" w:hAnsi="Courier New" w:cs="Courier New" w:hint="default"/>
+      </w:rPr>
+    </w:lvl>
+    <w:lvl w:ilvl="5" w:tplc="08090005" w:tentative="1">
+      <w:start w:val="1"/>
+      <w:numFmt w:val="bullet"/>
+      <w:lvlText w:val=""/>
+      <w:lvlJc w:val="left"/>
+      <w:pPr>
+        <w:ind w:left="4244" w:hanging="360"/>
+      </w:pPr>
+      <w:rPr>
+        <w:rFonts w:ascii="Wingdings" w:hAnsi="Wingdings" w:hint="default"/>
+      </w:rPr>
+    </w:lvl>
+    <w:lvl w:ilvl="6" w:tplc="08090001" w:tentative="1">
+      <w:start w:val="1"/>
+      <w:numFmt w:val="bullet"/>
+      <w:lvlText w:val=""/>
+      <w:lvlJc w:val="left"/>
+      <w:pPr>
+        <w:ind w:left="4964" w:hanging="360"/>
+      </w:pPr>
+      <w:rPr>
+        <w:rFonts w:ascii="Symbol" w:hAnsi="Symbol" w:hint="default"/>
+      </w:rPr>
+    </w:lvl>
+    <w:lvl w:ilvl="7" w:tplc="08090003" w:tentative="1">
+      <w:start w:val="1"/>
+      <w:numFmt w:val="bullet"/>
+      <w:lvlText w:val="o"/>
+      <w:lvlJc w:val="left"/>
+      <w:pPr>
+        <w:ind w:left="5684" w:hanging="360"/>
+      </w:pPr>
+      <w:rPr>
+        <w:rFonts w:ascii="Courier New" w:hAnsi="Courier New" w:cs="Courier New" w:hint="default"/>
+      </w:rPr>
+    </w:lvl>
+    <w:lvl w:ilvl="8" w:tplc="08090005" w:tentative="1">
+      <w:start w:val="1"/>
+      <w:numFmt w:val="bullet"/>
+      <w:lvlText w:val=""/>
+      <w:lvlJc w:val="left"/>
+      <w:pPr>
+        <w:ind w:left="6404" w:hanging="360"/>
+      </w:pPr>
+      <w:rPr>
+        <w:rFonts w:ascii="Wingdings" w:hAnsi="Wingdings" w:hint="default"/>
+      </w:rPr>
+    </w:lvl>
+  </w:abstractNum>
+  <w:abstractNum w:abstractNumId="4" w15:restartNumberingAfterBreak="0">
     <w:nsid w:val="6A42375B"/>
     <w:multiLevelType w:val="hybridMultilevel"/>
     <w:tmpl w:val="84AAD2FE"/>
@@ -1613,10 +922,16 @@
     <w:abstractNumId w:val="1"/>
   </w:num>
   <w:num w:numId="2" w16cid:durableId="267201254">
-    <w:abstractNumId w:val="2"/>
+    <w:abstractNumId w:val="4"/>
   </w:num>
   <w:num w:numId="3" w16cid:durableId="1102069367">
     <w:abstractNumId w:val="0"/>
+  </w:num>
+  <w:num w:numId="4" w16cid:durableId="744189259">
+    <w:abstractNumId w:val="2"/>
+  </w:num>
+  <w:num w:numId="5" w16cid:durableId="1881236325">
+    <w:abstractNumId w:val="3"/>
   </w:num>
 </w:numbering>
 </file>
@@ -2540,6 +1855,29 @@
       <w:spacing w:val="5"/>
     </w:rPr>
   </w:style>
+  <w:style w:type="character" w:styleId="Hyperlink">
+    <w:name w:val="Hyperlink"/>
+    <w:basedOn w:val="DefaultParagraphFont"/>
+    <w:uiPriority w:val="99"/>
+    <w:unhideWhenUsed/>
+    <w:rsid w:val="00335B17"/>
+    <w:rPr>
+      <w:color w:val="0563C1" w:themeColor="hyperlink"/>
+      <w:u w:val="single"/>
+    </w:rPr>
+  </w:style>
+  <w:style w:type="character" w:styleId="UnresolvedMention">
+    <w:name w:val="Unresolved Mention"/>
+    <w:basedOn w:val="DefaultParagraphFont"/>
+    <w:uiPriority w:val="99"/>
+    <w:semiHidden/>
+    <w:unhideWhenUsed/>
+    <w:rsid w:val="00335B17"/>
+    <w:rPr>
+      <w:color w:val="605E5C"/>
+      <w:shd w:val="clear" w:color="auto" w:fill="E1DFDD"/>
+    </w:rPr>
+  </w:style>
 </w:styles>
 </file>
 

</xml_diff>